<commit_message>
Remove overlaps from 2.5.1/2.5.2 and add section ownership handover note
Co-Authored-By: Claude Opus 5.5 <noreply@anthropic.com>
Claude-Session: https://claude.ai/code/session_01KrVvuWxDmBDGvHTuGVMuit
</commit_message>
<xml_diff>
--- a/literature-review/Section_2.5.2_Traditional_ML_Approaches.docx
+++ b/literature-review/Section_2.5.2_Traditional_ML_Approaches.docx
@@ -48,7 +48,7 @@
           <w:sz w:val="22"/>
           <w:szCs w:val="22"/>
         </w:rPr>
-        <w:t xml:space="preserve">. Statistical, fractal, time-domain, frequency-domain and other features are first extracted from the measured data, often with the help of signal-processing tools such as the discrete wavelet transform (DWT), and are then classified with algorithms such as artificial neural networks (ANNs), support vector machines (SVMs) and fuzzy inference systems [4]. This follows the two-step structure introduced in Section 2.5.1: extraction of a feature vector, followed by classification [2]. A key requirement is a correctly labelled training set containing a representative number of samples from each class (for example internal, surface and corona discharges), with the class of every training sample determined by an expert [4].</w:t>
+        <w:t xml:space="preserve">. Statistical, fractal, time-domain, frequency-domain and other features are first extracted from the measured data, often with the help of signal-processing tools such as the discrete wavelet transform (DWT), and are then classified with algorithms such as artificial neural networks (ANNs), support vector machines (SVMs) and fuzzy inference systems [4]. This follows the two-step structure of Section 2.5.1: extraction of a feature vector, followed by classification [1]. A key requirement is a correctly labelled training set containing a representative number of samples from each class, with the class of every training sample determined by an expert [4].</w:t>
       </w:r>
     </w:p>
     <w:p>
@@ -65,7 +65,7 @@
           <w:sz w:val="24"/>
           <w:szCs w:val="24"/>
         </w:rPr>
-        <w:t xml:space="preserve">2.5.2.1  Hand-crafted features</w:t>
+        <w:t xml:space="preserve">2.5.2.1  Feature inputs</w:t>
       </w:r>
     </w:p>
     <w:p>
@@ -76,20 +76,10 @@
       <w:r>
         <w:rPr>
           <w:rFonts w:ascii="Calibri" w:cs="Calibri" w:eastAsia="Calibri" w:hAnsi="Calibri"/>
-          <w:b/>
-          <w:bCs/>
-          <w:sz w:val="22"/>
-          <w:szCs w:val="22"/>
-        </w:rPr>
-        <w:t xml:space="preserve">Phase-resolved (statistical) features.</w:t>
-      </w:r>
-      <w:r>
-        <w:rPr>
-          <w:rFonts w:ascii="Calibri" w:cs="Calibri" w:eastAsia="Calibri" w:hAnsi="Calibri"/>
-          <w:sz w:val="22"/>
-          <w:szCs w:val="22"/>
-        </w:rPr>
-        <w:t xml:space="preserve"> Gulski and Krivda described the shape of the phase-resolved distributions with a set of 15 statistical operators [5]. The operators are computed from the mean pulse-height distribution Hqn(φ) and the pulse-count distribution Hn(φ), each split into the positive and negative half-cycles of the test voltage [5]. Table 3 summarises the main operators. Other phase-resolved descriptors include fractal features (fractal dimension and lacunarity) that treat the 3-D PRPD pattern as a fractal surface [2], and features obtained by principal component analysis (PCA) [1].</w:t>
+          <w:sz w:val="22"/>
+          <w:szCs w:val="22"/>
+        </w:rPr>
+        <w:t xml:space="preserve">The signal-processing methods used to obtain features (time-, frequency- and wavelet-domain analysis and denoising) are covered in Section 2.4.3; this section focuses on the features that traditional classifiers take as input. For phase-resolved data, Gulski and Krivda described the shape of the distributions with a set of 15 statistical operators computed from the mean pulse-height distribution Hqn(φ) and the pulse-count distribution Hn(φ), each split into the positive and negative half-cycles of the test voltage [3]. Table 2 summarises the main operators. Other phase-resolved descriptors include fractal features (fractal dimension and lacunarity) that treat the 3-D PRPD pattern as a fractal surface [1], and features obtained by principal component analysis (PCA) [8]. For time-resolved pulses, classifiers typically use amplitude, timing and pulse-shape parameters, statistical moments, and frequency- or wavelet-domain descriptors [4].</w:t>
       </w:r>
     </w:p>
     <w:p>
@@ -105,7 +95,7 @@
           <w:sz w:val="20"/>
           <w:szCs w:val="20"/>
         </w:rPr>
-        <w:t xml:space="preserve">Table 3.</w:t>
+        <w:t xml:space="preserve">Table 2.</w:t>
       </w:r>
       <w:r>
         <w:rPr>
@@ -113,7 +103,7 @@
           <w:sz w:val="20"/>
           <w:szCs w:val="20"/>
         </w:rPr>
-        <w:t xml:space="preserve"> Main statistical operators used to describe phase-resolved PD distributions [5].</w:t>
+        <w:t xml:space="preserve"> Main statistical operators used to describe phase-resolved PD distributions [3].</w:t>
       </w:r>
     </w:p>
     <w:tbl>
@@ -735,480 +725,52 @@
       <w:r>
         <w:rPr>
           <w:rFonts w:ascii="Calibri" w:cs="Calibri" w:eastAsia="Calibri" w:hAnsi="Calibri"/>
+          <w:sz w:val="22"/>
+          <w:szCs w:val="22"/>
+        </w:rPr>
+        <w:t xml:space="preserve">The choice of feature family affects the classifier. Statistical parameters allow large PD datasets to be processed quickly but can be affected by noise; signal- and image-processing features are precise but costly and need high-quality signals; and fractal features are unaffected by signal shifting, rotation and scaling but are hard to tune [4]. Most of these techniques still require a skilled operator to verify the computational parameters [4].</w:t>
+      </w:r>
+    </w:p>
+    <w:p>
+      <w:pPr>
+        <w:spacing w:after="140" w:line="276"/>
+        <w:jc w:val="both"/>
+      </w:pPr>
+      <w:r>
+        <w:rPr>
+          <w:rFonts w:ascii="Calibri" w:cs="Calibri" w:eastAsia="Calibri" w:hAnsi="Calibri"/>
           <w:b/>
           <w:bCs/>
           <w:sz w:val="22"/>
           <w:szCs w:val="22"/>
         </w:rPr>
-        <w:t xml:space="preserve">Time-resolved, frequency and wavelet features.</w:t>
-      </w:r>
-      <w:r>
-        <w:rPr>
-          <w:rFonts w:ascii="Calibri" w:cs="Calibri" w:eastAsia="Calibri" w:hAnsi="Calibri"/>
-          <w:sz w:val="22"/>
-          <w:szCs w:val="22"/>
-        </w:rPr>
-        <w:t xml:space="preserve"> When individual pulses are recorded, features can be taken directly from the time-domain waveform: peak-to-peak intervals, zero-crossings, mean, maximum and minimum amplitudes, the number of peaks, and statistical moments such as variance, skewness, kurtosis and root mean square [4]. General features (average discharge current, number of pulses, pulse repetition rate and pulse charge) and pulse-specific features (pulse width, rise time and decay time) are also used [4]. Frequency-domain features are obtained with the Fourier transform, the FFT and the short-time Fourier transform, and the wavelet transform analyses the signal in time and frequency simultaneously [4]. Table 4 compares the three most common techniques.</w:t>
-      </w:r>
-    </w:p>
-    <w:p>
-      <w:pPr>
-        <w:spacing w:after="80" w:before="200"/>
-        <w:jc w:val="center"/>
-      </w:pPr>
-      <w:r>
-        <w:rPr>
-          <w:rFonts w:ascii="Calibri" w:cs="Calibri" w:eastAsia="Calibri" w:hAnsi="Calibri"/>
-          <w:b/>
-          <w:bCs/>
-          <w:sz w:val="20"/>
-          <w:szCs w:val="20"/>
-        </w:rPr>
-        <w:t xml:space="preserve">Table 4.</w:t>
-      </w:r>
-      <w:r>
-        <w:rPr>
-          <w:rFonts w:ascii="Calibri" w:cs="Calibri" w:eastAsia="Calibri" w:hAnsi="Calibri"/>
-          <w:sz w:val="20"/>
-          <w:szCs w:val="20"/>
-        </w:rPr>
-        <w:t xml:space="preserve"> Advantages and disadvantages of common feature-extraction techniques (adapted from Kumar </w:t>
+        <w:t xml:space="preserve">Feature selection.</w:t>
+      </w:r>
+      <w:r>
+        <w:rPr>
+          <w:rFonts w:ascii="Calibri" w:cs="Calibri" w:eastAsia="Calibri" w:hAnsi="Calibri"/>
+          <w:sz w:val="22"/>
+          <w:szCs w:val="22"/>
+        </w:rPr>
+        <w:t xml:space="preserve"> Because many candidate features can be extracted, feature selection is often needed. Peng </w:t>
       </w:r>
       <w:r>
         <w:rPr>
           <w:rFonts w:ascii="Calibri" w:cs="Calibri" w:eastAsia="Calibri" w:hAnsi="Calibri"/>
           <w:i/>
           <w:iCs/>
-          <w:sz w:val="20"/>
-          <w:szCs w:val="20"/>
+          <w:sz w:val="22"/>
+          <w:szCs w:val="22"/>
         </w:rPr>
         <w:t xml:space="preserve">et al.</w:t>
       </w:r>
       <w:r>
         <w:rPr>
           <w:rFonts w:ascii="Calibri" w:cs="Calibri" w:eastAsia="Calibri" w:hAnsi="Calibri"/>
-          <w:sz w:val="20"/>
-          <w:szCs w:val="20"/>
-        </w:rPr>
-        <w:t xml:space="preserve"> [4], Table 3).</w:t>
-      </w:r>
-    </w:p>
-    <w:tbl>
-      <w:tblPr>
-        <w:tblW w:type="dxa" w:w="9026"/>
-        <w:tblBorders>
-          <w:top w:val="single" w:color="auto" w:sz="4"/>
-          <w:left w:val="single" w:color="auto" w:sz="4"/>
-          <w:bottom w:val="single" w:color="auto" w:sz="4"/>
-          <w:right w:val="single" w:color="auto" w:sz="4"/>
-          <w:insideH w:val="single" w:color="auto" w:sz="4"/>
-          <w:insideV w:val="single" w:color="auto" w:sz="4"/>
-        </w:tblBorders>
-      </w:tblPr>
-      <w:tblGrid>
-        <w:gridCol w:w="1500"/>
-        <w:gridCol w:w="3763"/>
-        <w:gridCol w:w="3763"/>
-      </w:tblGrid>
-      <w:tr>
-        <w:trPr>
-          <w:tblHeader/>
-        </w:trPr>
-        <w:tc>
-          <w:tcPr>
-            <w:tcW w:type="dxa" w:w="1500"/>
-            <w:tcBorders>
-              <w:top w:val="single" w:color="999999" w:sz="4"/>
-              <w:left w:val="single" w:color="999999" w:sz="4"/>
-              <w:bottom w:val="single" w:color="999999" w:sz="4"/>
-              <w:right w:val="single" w:color="999999" w:sz="4"/>
-            </w:tcBorders>
-            <w:shd w:fill="DCE6F2" w:color="auto" w:val="clear"/>
-            <w:tcMar>
-              <w:top w:type="dxa" w:w="60"/>
-              <w:left w:type="dxa" w:w="90"/>
-              <w:bottom w:type="dxa" w:w="60"/>
-              <w:right w:type="dxa" w:w="90"/>
-            </w:tcMar>
-          </w:tcPr>
-          <w:p>
-            <w:r>
-              <w:rPr>
-                <w:rFonts w:ascii="Calibri" w:cs="Calibri" w:eastAsia="Calibri" w:hAnsi="Calibri"/>
-                <w:b/>
-                <w:bCs/>
-                <w:sz w:val="18"/>
-                <w:szCs w:val="18"/>
-              </w:rPr>
-              <w:t xml:space="preserve">Technique</w:t>
-            </w:r>
-          </w:p>
-        </w:tc>
-        <w:tc>
-          <w:tcPr>
-            <w:tcW w:type="dxa" w:w="3763"/>
-            <w:tcBorders>
-              <w:top w:val="single" w:color="999999" w:sz="4"/>
-              <w:left w:val="single" w:color="999999" w:sz="4"/>
-              <w:bottom w:val="single" w:color="999999" w:sz="4"/>
-              <w:right w:val="single" w:color="999999" w:sz="4"/>
-            </w:tcBorders>
-            <w:shd w:fill="DCE6F2" w:color="auto" w:val="clear"/>
-            <w:tcMar>
-              <w:top w:type="dxa" w:w="60"/>
-              <w:left w:type="dxa" w:w="90"/>
-              <w:bottom w:type="dxa" w:w="60"/>
-              <w:right w:type="dxa" w:w="90"/>
-            </w:tcMar>
-          </w:tcPr>
-          <w:p>
-            <w:r>
-              <w:rPr>
-                <w:rFonts w:ascii="Calibri" w:cs="Calibri" w:eastAsia="Calibri" w:hAnsi="Calibri"/>
-                <w:b/>
-                <w:bCs/>
-                <w:sz w:val="18"/>
-                <w:szCs w:val="18"/>
-              </w:rPr>
-              <w:t xml:space="preserve">Advantages</w:t>
-            </w:r>
-          </w:p>
-        </w:tc>
-        <w:tc>
-          <w:tcPr>
-            <w:tcW w:type="dxa" w:w="3763"/>
-            <w:tcBorders>
-              <w:top w:val="single" w:color="999999" w:sz="4"/>
-              <w:left w:val="single" w:color="999999" w:sz="4"/>
-              <w:bottom w:val="single" w:color="999999" w:sz="4"/>
-              <w:right w:val="single" w:color="999999" w:sz="4"/>
-            </w:tcBorders>
-            <w:shd w:fill="DCE6F2" w:color="auto" w:val="clear"/>
-            <w:tcMar>
-              <w:top w:type="dxa" w:w="60"/>
-              <w:left w:type="dxa" w:w="90"/>
-              <w:bottom w:type="dxa" w:w="60"/>
-              <w:right w:type="dxa" w:w="90"/>
-            </w:tcMar>
-          </w:tcPr>
-          <w:p>
-            <w:r>
-              <w:rPr>
-                <w:rFonts w:ascii="Calibri" w:cs="Calibri" w:eastAsia="Calibri" w:hAnsi="Calibri"/>
-                <w:b/>
-                <w:bCs/>
-                <w:sz w:val="18"/>
-                <w:szCs w:val="18"/>
-              </w:rPr>
-              <w:t xml:space="preserve">Disadvantages</w:t>
-            </w:r>
-          </w:p>
-        </w:tc>
-      </w:tr>
-      <w:tr>
-        <w:tc>
-          <w:tcPr>
-            <w:tcW w:type="dxa" w:w="1500"/>
-            <w:tcBorders>
-              <w:top w:val="single" w:color="999999" w:sz="4"/>
-              <w:left w:val="single" w:color="999999" w:sz="4"/>
-              <w:bottom w:val="single" w:color="999999" w:sz="4"/>
-              <w:right w:val="single" w:color="999999" w:sz="4"/>
-            </w:tcBorders>
-            <w:tcMar>
-              <w:top w:type="dxa" w:w="60"/>
-              <w:left w:type="dxa" w:w="90"/>
-              <w:bottom w:type="dxa" w:w="60"/>
-              <w:right w:type="dxa" w:w="90"/>
-            </w:tcMar>
-          </w:tcPr>
-          <w:p>
-            <w:r>
-              <w:rPr>
-                <w:rFonts w:ascii="Calibri" w:cs="Calibri" w:eastAsia="Calibri" w:hAnsi="Calibri"/>
-                <w:sz w:val="18"/>
-                <w:szCs w:val="18"/>
-              </w:rPr>
-              <w:t xml:space="preserve">PRPD</w:t>
-            </w:r>
-          </w:p>
-        </w:tc>
-        <w:tc>
-          <w:tcPr>
-            <w:tcW w:type="dxa" w:w="3763"/>
-            <w:tcBorders>
-              <w:top w:val="single" w:color="999999" w:sz="4"/>
-              <w:left w:val="single" w:color="999999" w:sz="4"/>
-              <w:bottom w:val="single" w:color="999999" w:sz="4"/>
-              <w:right w:val="single" w:color="999999" w:sz="4"/>
-            </w:tcBorders>
-            <w:tcMar>
-              <w:top w:type="dxa" w:w="60"/>
-              <w:left w:type="dxa" w:w="90"/>
-              <w:bottom w:type="dxa" w:w="60"/>
-              <w:right w:type="dxa" w:w="90"/>
-            </w:tcMar>
-          </w:tcPr>
-          <w:p>
-            <w:r>
-              <w:rPr>
-                <w:rFonts w:ascii="Calibri" w:cs="Calibri" w:eastAsia="Calibri" w:hAnsi="Calibri"/>
-                <w:sz w:val="18"/>
-                <w:szCs w:val="18"/>
-              </w:rPr>
-              <w:t xml:space="preserve">Very effective for analysing repetitive PD patterns; provides temporal discharge information</w:t>
-            </w:r>
-          </w:p>
-        </w:tc>
-        <w:tc>
-          <w:tcPr>
-            <w:tcW w:type="dxa" w:w="3763"/>
-            <w:tcBorders>
-              <w:top w:val="single" w:color="999999" w:sz="4"/>
-              <w:left w:val="single" w:color="999999" w:sz="4"/>
-              <w:bottom w:val="single" w:color="999999" w:sz="4"/>
-              <w:right w:val="single" w:color="999999" w:sz="4"/>
-            </w:tcBorders>
-            <w:tcMar>
-              <w:top w:type="dxa" w:w="60"/>
-              <w:left w:type="dxa" w:w="90"/>
-              <w:bottom w:type="dxa" w:w="60"/>
-              <w:right w:type="dxa" w:w="90"/>
-            </w:tcMar>
-          </w:tcPr>
-          <w:p>
-            <w:r>
-              <w:rPr>
-                <w:rFonts w:ascii="Calibri" w:cs="Calibri" w:eastAsia="Calibri" w:hAnsi="Calibri"/>
-                <w:sz w:val="18"/>
-                <w:szCs w:val="18"/>
-              </w:rPr>
-              <w:t xml:space="preserve">Limited to signals with repetitive patterns; may not capture the frequency content of the signal</w:t>
-            </w:r>
-          </w:p>
-        </w:tc>
-      </w:tr>
-      <w:tr>
-        <w:tc>
-          <w:tcPr>
-            <w:tcW w:type="dxa" w:w="1500"/>
-            <w:tcBorders>
-              <w:top w:val="single" w:color="999999" w:sz="4"/>
-              <w:left w:val="single" w:color="999999" w:sz="4"/>
-              <w:bottom w:val="single" w:color="999999" w:sz="4"/>
-              <w:right w:val="single" w:color="999999" w:sz="4"/>
-            </w:tcBorders>
-            <w:tcMar>
-              <w:top w:type="dxa" w:w="60"/>
-              <w:left w:type="dxa" w:w="90"/>
-              <w:bottom w:type="dxa" w:w="60"/>
-              <w:right w:type="dxa" w:w="90"/>
-            </w:tcMar>
-          </w:tcPr>
-          <w:p>
-            <w:r>
-              <w:rPr>
-                <w:rFonts w:ascii="Calibri" w:cs="Calibri" w:eastAsia="Calibri" w:hAnsi="Calibri"/>
-                <w:sz w:val="18"/>
-                <w:szCs w:val="18"/>
-              </w:rPr>
-              <w:t xml:space="preserve">FFT</w:t>
-            </w:r>
-          </w:p>
-        </w:tc>
-        <w:tc>
-          <w:tcPr>
-            <w:tcW w:type="dxa" w:w="3763"/>
-            <w:tcBorders>
-              <w:top w:val="single" w:color="999999" w:sz="4"/>
-              <w:left w:val="single" w:color="999999" w:sz="4"/>
-              <w:bottom w:val="single" w:color="999999" w:sz="4"/>
-              <w:right w:val="single" w:color="999999" w:sz="4"/>
-            </w:tcBorders>
-            <w:tcMar>
-              <w:top w:type="dxa" w:w="60"/>
-              <w:left w:type="dxa" w:w="90"/>
-              <w:bottom w:type="dxa" w:w="60"/>
-              <w:right w:type="dxa" w:w="90"/>
-            </w:tcMar>
-          </w:tcPr>
-          <w:p>
-            <w:r>
-              <w:rPr>
-                <w:rFonts w:ascii="Calibri" w:cs="Calibri" w:eastAsia="Calibri" w:hAnsi="Calibri"/>
-                <w:sz w:val="18"/>
-                <w:szCs w:val="18"/>
-              </w:rPr>
-              <w:t xml:space="preserve">Computationally efficient; gives information on repetitive patterns and frequency content</w:t>
-            </w:r>
-          </w:p>
-        </w:tc>
-        <w:tc>
-          <w:tcPr>
-            <w:tcW w:type="dxa" w:w="3763"/>
-            <w:tcBorders>
-              <w:top w:val="single" w:color="999999" w:sz="4"/>
-              <w:left w:val="single" w:color="999999" w:sz="4"/>
-              <w:bottom w:val="single" w:color="999999" w:sz="4"/>
-              <w:right w:val="single" w:color="999999" w:sz="4"/>
-            </w:tcBorders>
-            <w:tcMar>
-              <w:top w:type="dxa" w:w="60"/>
-              <w:left w:type="dxa" w:w="90"/>
-              <w:bottom w:type="dxa" w:w="60"/>
-              <w:right w:type="dxa" w:w="90"/>
-            </w:tcMar>
-          </w:tcPr>
-          <w:p>
-            <w:r>
-              <w:rPr>
-                <w:rFonts w:ascii="Calibri" w:cs="Calibri" w:eastAsia="Calibri" w:hAnsi="Calibri"/>
-                <w:sz w:val="18"/>
-                <w:szCs w:val="18"/>
-              </w:rPr>
-              <w:t xml:space="preserve">No temporal information on the frequency components; may be unsuitable for non-stationary signals</w:t>
-            </w:r>
-          </w:p>
-        </w:tc>
-      </w:tr>
-      <w:tr>
-        <w:tc>
-          <w:tcPr>
-            <w:tcW w:type="dxa" w:w="1500"/>
-            <w:tcBorders>
-              <w:top w:val="single" w:color="999999" w:sz="4"/>
-              <w:left w:val="single" w:color="999999" w:sz="4"/>
-              <w:bottom w:val="single" w:color="999999" w:sz="4"/>
-              <w:right w:val="single" w:color="999999" w:sz="4"/>
-            </w:tcBorders>
-            <w:tcMar>
-              <w:top w:type="dxa" w:w="60"/>
-              <w:left w:type="dxa" w:w="90"/>
-              <w:bottom w:type="dxa" w:w="60"/>
-              <w:right w:type="dxa" w:w="90"/>
-            </w:tcMar>
-          </w:tcPr>
-          <w:p>
-            <w:r>
-              <w:rPr>
-                <w:rFonts w:ascii="Calibri" w:cs="Calibri" w:eastAsia="Calibri" w:hAnsi="Calibri"/>
-                <w:sz w:val="18"/>
-                <w:szCs w:val="18"/>
-              </w:rPr>
-              <w:t xml:space="preserve">DWT</w:t>
-            </w:r>
-          </w:p>
-        </w:tc>
-        <w:tc>
-          <w:tcPr>
-            <w:tcW w:type="dxa" w:w="3763"/>
-            <w:tcBorders>
-              <w:top w:val="single" w:color="999999" w:sz="4"/>
-              <w:left w:val="single" w:color="999999" w:sz="4"/>
-              <w:bottom w:val="single" w:color="999999" w:sz="4"/>
-              <w:right w:val="single" w:color="999999" w:sz="4"/>
-            </w:tcBorders>
-            <w:tcMar>
-              <w:top w:type="dxa" w:w="60"/>
-              <w:left w:type="dxa" w:w="90"/>
-              <w:bottom w:type="dxa" w:w="60"/>
-              <w:right w:type="dxa" w:w="90"/>
-            </w:tcMar>
-          </w:tcPr>
-          <w:p>
-            <w:r>
-              <w:rPr>
-                <w:rFonts w:ascii="Calibri" w:cs="Calibri" w:eastAsia="Calibri" w:hAnsi="Calibri"/>
-                <w:sz w:val="18"/>
-                <w:szCs w:val="18"/>
-              </w:rPr>
-              <w:t xml:space="preserve">Time–frequency localisation; suitable for non-stationary signals; provides high- and low-frequency components</w:t>
-            </w:r>
-          </w:p>
-        </w:tc>
-        <w:tc>
-          <w:tcPr>
-            <w:tcW w:type="dxa" w:w="3763"/>
-            <w:tcBorders>
-              <w:top w:val="single" w:color="999999" w:sz="4"/>
-              <w:left w:val="single" w:color="999999" w:sz="4"/>
-              <w:bottom w:val="single" w:color="999999" w:sz="4"/>
-              <w:right w:val="single" w:color="999999" w:sz="4"/>
-            </w:tcBorders>
-            <w:tcMar>
-              <w:top w:type="dxa" w:w="60"/>
-              <w:left w:type="dxa" w:w="90"/>
-              <w:bottom w:type="dxa" w:w="60"/>
-              <w:right w:type="dxa" w:w="90"/>
-            </w:tcMar>
-          </w:tcPr>
-          <w:p>
-            <w:r>
-              <w:rPr>
-                <w:rFonts w:ascii="Calibri" w:cs="Calibri" w:eastAsia="Calibri" w:hAnsi="Calibri"/>
-                <w:sz w:val="18"/>
-                <w:szCs w:val="18"/>
-              </w:rPr>
-              <w:t xml:space="preserve">More computationally intensive than the FFT; results depend on the choice of wavelet and decomposition level</w:t>
-            </w:r>
-          </w:p>
-        </w:tc>
-      </w:tr>
-    </w:tbl>
-    <w:p>
-      <w:pPr>
-        <w:spacing w:after="140" w:line="276"/>
-        <w:jc w:val="both"/>
-      </w:pPr>
-      <w:r>
-        <w:rPr>
-          <w:rFonts w:ascii="Calibri" w:cs="Calibri" w:eastAsia="Calibri" w:hAnsi="Calibri"/>
-          <w:sz w:val="22"/>
-          <w:szCs w:val="22"/>
-        </w:rPr>
-        <w:t xml:space="preserve">Each feature family has trade-offs. Statistical parameters allow large PD datasets to be processed quickly, but their results can be affected by noise; signal- and image-processing features are precise but costly, time-consuming and require high-quality signals; and fractal features are unaffected by signal shifting, rotation and scaling but are hard to tune because they are sensitive to parameter choice [4]. Most of these techniques still require a skilled operator to verify the computational parameters [4]. Time-domain features are also linked to the noise-affected pulse peak value, and thresholding leads to less precise classification [4].</w:t>
-      </w:r>
-    </w:p>
-    <w:p>
-      <w:pPr>
-        <w:spacing w:after="140" w:line="276"/>
-        <w:jc w:val="both"/>
-      </w:pPr>
-      <w:r>
-        <w:rPr>
-          <w:rFonts w:ascii="Calibri" w:cs="Calibri" w:eastAsia="Calibri" w:hAnsi="Calibri"/>
-          <w:b/>
-          <w:bCs/>
-          <w:sz w:val="22"/>
-          <w:szCs w:val="22"/>
-        </w:rPr>
-        <w:t xml:space="preserve">Feature selection.</w:t>
-      </w:r>
-      <w:r>
-        <w:rPr>
-          <w:rFonts w:ascii="Calibri" w:cs="Calibri" w:eastAsia="Calibri" w:hAnsi="Calibri"/>
-          <w:sz w:val="22"/>
-          <w:szCs w:val="22"/>
-        </w:rPr>
-        <w:t xml:space="preserve"> Because many candidate features can be extracted, feature selection is often needed. Peng </w:t>
-      </w:r>
-      <w:r>
-        <w:rPr>
-          <w:rFonts w:ascii="Calibri" w:cs="Calibri" w:eastAsia="Calibri" w:hAnsi="Calibri"/>
-          <w:i/>
-          <w:iCs/>
-          <w:sz w:val="22"/>
-          <w:szCs w:val="22"/>
-        </w:rPr>
-        <w:t xml:space="preserve">et al.</w:t>
-      </w:r>
-      <w:r>
-        <w:rPr>
-          <w:rFonts w:ascii="Calibri" w:cs="Calibri" w:eastAsia="Calibri" w:hAnsi="Calibri"/>
-          <w:sz w:val="22"/>
-          <w:szCs w:val="22"/>
-        </w:rPr>
-        <w:t xml:space="preserve"> extracted 34 PD features from 3 500 PD pulses and 3 500 interference pulses recorded from defects created in a cable, generated a further 119 two-dimensional and 1 082 three-dimensional features, and used a random-forest (RF) algorithm to select the optimal features; the selected features were evaluated with a back-propagation neural network (BPNN) and an SVM, and the method was reported to be effective [9]. Feature selection matters because the amount of data required grows with the number of features (approximately 5–20 fingerprints per feature, Section 2.5.1) [3].</w:t>
+          <w:sz w:val="22"/>
+          <w:szCs w:val="22"/>
+        </w:rPr>
+        <w:t xml:space="preserve"> extracted 34 PD features from 3 500 PD pulses and 3 500 interference pulses recorded from defects created in a cable, generated a further 119 two-dimensional and 1 082 three-dimensional features, and used a random-forest (RF) algorithm to select the optimal features; the selected features were evaluated with a back-propagation neural network (BPNN) and an SVM, and the method was reported to be effective [9]. Feature selection matters because the amount of data required grows with the number of features (approximately 5–20 fingerprints per feature) [2].</w:t>
       </w:r>
     </w:p>
     <w:p>
@@ -1249,7 +811,7 @@
           <w:sz w:val="22"/>
           <w:szCs w:val="22"/>
         </w:rPr>
-        <w:t xml:space="preserve"> Neural networks were among the first automated PD classifiers. Gulski and Krivda fed the 15 statistical operators into three networks, a back-propagation network, a Kohonen self-organising map and a learning vector quantisation network, using PD measured with a conventional detector of 40–400 kHz bandwidth [5]. All networks recognised trained defects well; with twelve defect types the back-propagation network showed the best ability to learn, and the results were only slightly dependent on the number of processing elements, learning cycles and convergence criterion [5]. Training took about 3 min for two defects and from 30 min to 3 h for twelve defects, and patterns for which the networks were not trained could be wrongly recognised as one of the known defects [5].</w:t>
+        <w:t xml:space="preserve"> Neural networks were among the first automated PD classifiers. Gulski and Krivda fed the 15 statistical operators into three networks, a back-propagation network, a Kohonen self-organising map and a learning vector quantisation network, using PD measured with a conventional detector of 40–400 kHz bandwidth [3]. All networks recognised trained defects well; with twelve defect types the back-propagation network showed the best ability to learn, and the results were only slightly dependent on the number of processing elements, learning cycles and convergence criterion [3]. Training took about 3 min for two defects and from 30 min to 3 h for twelve defects [3].</w:t>
       </w:r>
     </w:p>
     <w:p>
@@ -1341,7 +903,7 @@
           <w:sz w:val="22"/>
           <w:szCs w:val="22"/>
         </w:rPr>
-        <w:t xml:space="preserve"> (Figure 7) [4]. When classes overlap, a soft-margin SVM tolerates some misclassified points, and a kernel trick maps the data into a space where they can be separated linearly; the regularisation parameter C controls the trade-off between a wide margin and training errors, which helps to prevent overfitting on noisy measurements [4]. Unlike ANNs, SVMs do not require the number of layers or neurons to be chosen in advance, and PD classification with SVMs has generally produced better results than other classifiers, including neural networks [4].</w:t>
+        <w:t xml:space="preserve"> (Figure 4) [4]. When classes overlap, a soft-margin SVM tolerates some misclassified points, and a kernel trick maps the data into a space where they can be separated linearly; the regularisation parameter C controls the trade-off between a wide margin and training errors, which helps to prevent overfitting on noisy measurements [4]. Unlike ANNs, SVMs do not require the number of layers or neurons to be chosen in advance, and PD classification with SVMs has generally produced better results than other classifiers, including neural networks [4].</w:t>
       </w:r>
     </w:p>
     <w:p>
@@ -1405,7 +967,7 @@
           <w:sz w:val="20"/>
           <w:szCs w:val="20"/>
         </w:rPr>
-        <w:t xml:space="preserve">Figure 7.</w:t>
+        <w:t xml:space="preserve">Figure 4.</w:t>
       </w:r>
       <w:r>
         <w:rPr>
@@ -1459,7 +1021,7 @@
           <w:sz w:val="22"/>
           <w:szCs w:val="22"/>
         </w:rPr>
-        <w:t xml:space="preserve"> Earlier work also used minimum-distance and nearest-neighbour classifiers, Bayes classifiers and fuzzy-logic classifiers [2], and adaptive neuro-fuzzy inference systems (ANFIS) [1]. Random forests, decision trees and logistic regression are further common machine-learning algorithms [4], and random forests have also been used for feature selection [9].</w:t>
+        <w:t xml:space="preserve"> Earlier work also used minimum-distance and nearest-neighbour classifiers, Bayes classifiers and fuzzy-logic classifiers [1], and adaptive neuro-fuzzy inference systems (ANFIS) [8]. Random forests, decision trees and logistic regression are further common machine-learning algorithms [4], and random forests have also been used for feature selection [9].</w:t>
       </w:r>
     </w:p>
     <w:p>
@@ -1490,7 +1052,7 @@
           <w:sz w:val="22"/>
           <w:szCs w:val="22"/>
         </w:rPr>
-        <w:t xml:space="preserve">Table 5 summarises results reported by studies that used traditional classifiers on cable or cable-accessory defects. The values come from different datasets, class definitions and train/test splits, so they show what each method achieved in its own study and cannot be ranked directly against each other.</w:t>
+        <w:t xml:space="preserve">Table 3 summarises results reported by studies that used traditional classifiers on cable or cable-accessory defects. The values come from different datasets, class definitions and train/test splits, so they show what each method achieved in its own study and cannot be ranked directly against each other. All values in Table 3 were obtained on laboratory data without added noise; robustness to noise and generalisation are examined in Section 2.5.5.</w:t>
       </w:r>
     </w:p>
     <w:p>
@@ -1506,7 +1068,7 @@
           <w:sz w:val="20"/>
           <w:szCs w:val="20"/>
         </w:rPr>
-        <w:t xml:space="preserve">Table 5.</w:t>
+        <w:t xml:space="preserve">Table 3.</w:t>
       </w:r>
       <w:r>
         <w:rPr>
@@ -1702,7 +1264,7 @@
                 <w:sz w:val="18"/>
                 <w:szCs w:val="18"/>
               </w:rPr>
-              <w:t xml:space="preserve"> 2017 [1]</w:t>
+              <w:t xml:space="preserve"> 2017 [8]</w:t>
             </w:r>
           </w:p>
         </w:tc>
@@ -1783,7 +1345,7 @@
                 <w:sz w:val="18"/>
                 <w:szCs w:val="18"/>
               </w:rPr>
-              <w:t xml:space="preserve">Noise-free data, best feature set: SVM 98.8%, ANFIS 97.0%, ANN 93.2%. With 60 s of real noise, PCA features: SVM 75.6%, ANN 70.4%, ANFIS 53.0%</w:t>
+              <w:t xml:space="preserve">Best feature set for each classifier: SVM 98.8%, ANFIS 97.0%, ANN 93.2%</w:t>
             </w:r>
           </w:p>
         </w:tc>
@@ -1830,7 +1392,7 @@
                 <w:sz w:val="18"/>
                 <w:szCs w:val="18"/>
               </w:rPr>
-              <w:t xml:space="preserve"> 2024 [8]</w:t>
+              <w:t xml:space="preserve"> 2024 [7]</w:t>
             </w:r>
           </w:p>
         </w:tc>
@@ -1958,7 +1520,7 @@
                 <w:sz w:val="18"/>
                 <w:szCs w:val="18"/>
               </w:rPr>
-              <w:t xml:space="preserve"> 2024 [7]</w:t>
+              <w:t xml:space="preserve"> 2024 [6]</w:t>
             </w:r>
           </w:p>
         </w:tc>
@@ -2196,7 +1758,7 @@
                 <w:sz w:val="18"/>
                 <w:szCs w:val="18"/>
               </w:rPr>
-              <w:t xml:space="preserve">Gulski and Krivda 1993 [5]</w:t>
+              <w:t xml:space="preserve">Gulski and Krivda 1993 [3]</w:t>
             </w:r>
           </w:p>
         </w:tc>
@@ -2283,132 +1845,6 @@
         </w:tc>
       </w:tr>
     </w:tbl>
-    <w:p>
-      <w:pPr>
-        <w:spacing w:after="140" w:line="276"/>
-        <w:jc w:val="both"/>
-      </w:pPr>
-      <w:r>
-        <w:rPr>
-          <w:rFonts w:ascii="Calibri" w:cs="Calibri" w:eastAsia="Calibri" w:hAnsi="Calibri"/>
-          <w:sz w:val="22"/>
-          <w:szCs w:val="22"/>
-        </w:rPr>
-        <w:t xml:space="preserve">Figure 8 shows why results on clean laboratory data must be interpreted carefully. In the study by Raymond </w:t>
-      </w:r>
-      <w:r>
-        <w:rPr>
-          <w:rFonts w:ascii="Calibri" w:cs="Calibri" w:eastAsia="Calibri" w:hAnsi="Calibri"/>
-          <w:i/>
-          <w:iCs/>
-          <w:sz w:val="22"/>
-          <w:szCs w:val="22"/>
-        </w:rPr>
-        <w:t xml:space="preserve">et al.</w:t>
-      </w:r>
-      <w:r>
-        <w:rPr>
-          <w:rFonts w:ascii="Calibri" w:cs="Calibri" w:eastAsia="Calibri" w:hAnsi="Calibri"/>
-          <w:sz w:val="22"/>
-          <w:szCs w:val="22"/>
-        </w:rPr>
-        <w:t xml:space="preserve">, classifiers were trained on noise-free data and tested on data with 5–60 s of recorded ground-interference noise added; statistical features gave the best accuracy on clean data, but PCA features were the most robust as the noise increased [1].</w:t>
-      </w:r>
-    </w:p>
-    <w:p>
-      <w:pPr>
-        <w:spacing w:after="60" w:before="120"/>
-        <w:jc w:val="center"/>
-      </w:pPr>
-      <w:r>
-        <w:drawing>
-          <wp:inline distT="0" distB="0" distL="0" distR="0">
-            <wp:extent cx="5715000" cy="1295400"/>
-            <wp:effectExtent t="0" r="0" b="0" l="0"/>
-            <wp:docPr id="1" name="" descr="" title=""/>
-            <wp:cNvGraphicFramePr>
-              <a:graphicFrameLocks xmlns:a="http://schemas.openxmlformats.org/drawingml/2006/main" noChangeAspect="1"/>
-            </wp:cNvGraphicFramePr>
-            <a:graphic xmlns:a="http://schemas.openxmlformats.org/drawingml/2006/main">
-              <a:graphicData uri="http://schemas.openxmlformats.org/drawingml/2006/picture">
-                <pic:pic xmlns:pic="http://schemas.openxmlformats.org/drawingml/2006/picture">
-                  <pic:nvPicPr>
-                    <pic:cNvPr id="0" name="" descr=""/>
-                    <pic:cNvPicPr>
-                      <a:picLocks noChangeAspect="1" noChangeArrowheads="1"/>
-                    </pic:cNvPicPr>
-                  </pic:nvPicPr>
-                  <pic:blipFill>
-                    <a:blip r:embed="rId9" cstate="none"/>
-                    <a:srcRect/>
-                    <a:stretch>
-                      <a:fillRect/>
-                    </a:stretch>
-                  </pic:blipFill>
-                  <pic:spPr bwMode="auto">
-                    <a:xfrm>
-                      <a:off x="0" y="0"/>
-                      <a:ext cx="5715000" cy="1295400"/>
-                    </a:xfrm>
-                    <a:prstGeom prst="rect">
-                      <a:avLst/>
-                    </a:prstGeom>
-                  </pic:spPr>
-                </pic:pic>
-              </a:graphicData>
-            </a:graphic>
-          </wp:inline>
-        </w:drawing>
-      </w:r>
-    </w:p>
-    <w:p>
-      <w:pPr>
-        <w:spacing w:after="200"/>
-        <w:jc w:val="center"/>
-      </w:pPr>
-      <w:r>
-        <w:rPr>
-          <w:rFonts w:ascii="Calibri" w:cs="Calibri" w:eastAsia="Calibri" w:hAnsi="Calibri"/>
-          <w:b/>
-          <w:bCs/>
-          <w:i w:val="false"/>
-          <w:iCs w:val="false"/>
-          <w:sz w:val="20"/>
-          <w:szCs w:val="20"/>
-        </w:rPr>
-        <w:t xml:space="preserve">Figure 8.</w:t>
-      </w:r>
-      <w:r>
-        <w:rPr>
-          <w:rFonts w:ascii="Calibri" w:cs="Calibri" w:eastAsia="Calibri" w:hAnsi="Calibri"/>
-          <w:i w:val="false"/>
-          <w:iCs w:val="false"/>
-          <w:sz w:val="20"/>
-          <w:szCs w:val="20"/>
-        </w:rPr>
-        <w:t xml:space="preserve"> Classification accuracy against duration of added noise for (a) ANN, (b) ANFIS and (c) SVM with statistical, fractal and PCA features. Rearranged from Raymond </w:t>
-      </w:r>
-      <w:r>
-        <w:rPr>
-          <w:rFonts w:ascii="Calibri" w:cs="Calibri" w:eastAsia="Calibri" w:hAnsi="Calibri"/>
-          <w:i/>
-          <w:iCs/>
-          <w:sz w:val="20"/>
-          <w:szCs w:val="20"/>
-        </w:rPr>
-        <w:t xml:space="preserve">et al.</w:t>
-      </w:r>
-      <w:r>
-        <w:rPr>
-          <w:rFonts w:ascii="Calibri" w:cs="Calibri" w:eastAsia="Calibri" w:hAnsi="Calibri"/>
-          <w:i w:val="false"/>
-          <w:iCs w:val="false"/>
-          <w:sz w:val="20"/>
-          <w:szCs w:val="20"/>
-        </w:rPr>
-        <w:t xml:space="preserve"> [1], Fig. 5, under the CC BY 4.0 licence.</w:t>
-      </w:r>
-    </w:p>
     <w:p>
       <w:pPr>
         <w:pStyle w:val="Heading3"/>
@@ -2452,7 +1888,7 @@
           <w:sz w:val="22"/>
           <w:szCs w:val="22"/>
         </w:rPr>
-        <w:t xml:space="preserve"> The features have a physical meaning that engineers can interpret (Table 3), the classifiers can reach high accuracy on clean laboratory data (up to 98.8% in [1] and 97.29% in [8]), and training is fast: in [1] the SVM trained fastest, and its training time was not directly affected by feature size [1]. Traditional classifiers can also be competitive with deep learning on the same data: in [7] the BPNN reached 94.8% against 95.8% for the CNN.</w:t>
+        <w:t xml:space="preserve"> The features have a physical meaning that engineers can interpret (Table 2), the classifiers can reach high accuracy on clean laboratory data (up to 98.8% in [8] and 97.29% in [7]), and training is fast: the SVM trained fastest in [8], and its training time was not directly affected by feature size. Traditional classifiers can also be competitive with deep learning on the same data: the BPNN in [6] reached 94.8% against 95.8% for the CNN.</w:t>
       </w:r>
     </w:p>
     <w:p>
@@ -2481,7 +1917,7 @@
           <w:sz w:val="22"/>
           <w:szCs w:val="22"/>
         </w:rPr>
-        <w:t xml:space="preserve"> Performance depends on which features are chosen and on expert knowledge to set and verify them [4]. In [1] the feature set that was best on clean data was not the most robust under noise.</w:t>
+        <w:t xml:space="preserve"> Performance depends on which features are chosen and on expert knowledge to set and verify them [4].</w:t>
       </w:r>
     </w:p>
     <w:p>
@@ -2510,7 +1946,7 @@
           <w:sz w:val="22"/>
           <w:szCs w:val="22"/>
         </w:rPr>
-        <w:t xml:space="preserve"> With statistical features, SVM accuracy fell from 91.6% with 5 s of noise to 48.2% with 60 s [1].</w:t>
+        <w:t xml:space="preserve"> High accuracy on clean data is not maintained when noise is present, and the best features on clean data are not necessarily the most robust [8]; this is quantified in Section 2.5.5.</w:t>
       </w:r>
     </w:p>
     <w:p>
@@ -2539,7 +1975,7 @@
           <w:sz w:val="22"/>
           <w:szCs w:val="22"/>
         </w:rPr>
-        <w:t xml:space="preserve"> Optimising the SVM parameters raised the average accuracy from 84.52% to 97.29%, a gain of 12.77 percentage points on the same features [8].</w:t>
+        <w:t xml:space="preserve"> Optimising the SVM parameters raised the average accuracy from 84.52% to 97.29%, a gain of 12.77 percentage points on the same features [7].</w:t>
       </w:r>
     </w:p>
     <w:p>
@@ -2568,7 +2004,7 @@
           <w:sz w:val="22"/>
           <w:szCs w:val="22"/>
         </w:rPr>
-        <w:t xml:space="preserve"> ANNs need sufficient real examples and can overtrain [4], and classifiers trained on known defects may assign untrained patterns to a known class [5].</w:t>
+        <w:t xml:space="preserve"> ANNs need sufficient real examples and can overtrain [4], and classifiers trained on known defects may assign untrained patterns to a known class [3].</w:t>
       </w:r>
     </w:p>
     <w:p>
@@ -2600,7 +2036,7 @@
           <w:sz w:val="22"/>
           <w:szCs w:val="22"/>
         </w:rPr>
-        <w:t xml:space="preserve"> against which the deep-learning models are judged. An SVM and a random forest will be trained on hand-crafted features (statistical operators from PRPD data and time-, frequency- and wavelet-domain features from HFCT pulses) for the four classes defined in Section 2.5.1, using the same data and the same train/test split as the deep-learning models. The dependence of these methods on manual feature design and their sensitivity to noise motivate the deep-learning approaches reviewed in Section 2.5.3.</w:t>
+        <w:t xml:space="preserve"> against which the deep-learning models are judged (Section 2.5.4). An SVM and a random forest will be trained on hand-crafted features for the four classes defined in Section 2.5.1, using the same data and the same train/test split as the deep-learning models. The dependence of these methods on manual feature design motivates the deep-learning approaches reviewed in Section 2.5.3.</w:t>
       </w:r>
     </w:p>
     <w:p>
@@ -2639,7 +2075,7 @@
           <w:sz w:val="22"/>
           <w:szCs w:val="22"/>
         </w:rPr>
-        <w:t xml:space="preserve">W. J. K. Raymond, H. A. Illias, and A. H. A. Bakar, “Classification of partial discharge measured under different levels of noise contamination,” </w:t>
+        <w:t xml:space="preserve">N. C. Sahoo, M. M. A. Salama, and R. Bartnikas, “Trends in partial discharge pattern classification: a survey,” </w:t>
       </w:r>
       <w:r>
         <w:rPr>
@@ -2649,6 +2085,396 @@
           <w:sz w:val="22"/>
           <w:szCs w:val="22"/>
         </w:rPr>
+        <w:t xml:space="preserve">IEEE Trans. Dielectr. Electr. Insul.</w:t>
+      </w:r>
+      <w:r>
+        <w:rPr>
+          <w:rFonts w:ascii="Calibri" w:cs="Calibri" w:eastAsia="Calibri" w:hAnsi="Calibri"/>
+          <w:sz w:val="22"/>
+          <w:szCs w:val="22"/>
+        </w:rPr>
+        <w:t xml:space="preserve">, vol. 12, no. 2, pp. 248–264, 2005.</w:t>
+      </w:r>
+      <w:r>
+        <w:rPr>
+          <w:rFonts w:ascii="Calibri" w:cs="Calibri" w:eastAsia="Calibri" w:hAnsi="Calibri"/>
+          <w:sz w:val="22"/>
+          <w:szCs w:val="22"/>
+        </w:rPr>
+        <w:t xml:space="preserve"> </w:t>
+      </w:r>
+      <w:hyperlink w:history="1" r:id="rIdrjdbv-uwtonvazabvwelc">
+        <w:r>
+          <w:rPr>
+            <w:rStyle w:val="Hyperlink"/>
+            <w:rFonts w:ascii="Calibri" w:cs="Calibri" w:eastAsia="Calibri" w:hAnsi="Calibri"/>
+            <w:sz w:val="22"/>
+            <w:szCs w:val="22"/>
+          </w:rPr>
+          <w:t xml:space="preserve">https://doi.org/10.1109/TDEI.2005.1430395</w:t>
+        </w:r>
+      </w:hyperlink>
+    </w:p>
+    <w:p>
+      <w:pPr>
+        <w:spacing w:after="100"/>
+        <w:ind w:left="500" w:hanging="500"/>
+      </w:pPr>
+      <w:r>
+        <w:rPr>
+          <w:rFonts w:ascii="Calibri" w:cs="Calibri" w:eastAsia="Calibri" w:hAnsi="Calibri"/>
+          <w:sz w:val="22"/>
+          <w:szCs w:val="22"/>
+        </w:rPr>
+        <w:t xml:space="preserve">[2]	</w:t>
+      </w:r>
+      <w:r>
+        <w:rPr>
+          <w:rFonts w:ascii="Calibri" w:cs="Calibri" w:eastAsia="Calibri" w:hAnsi="Calibri"/>
+          <w:sz w:val="22"/>
+          <w:szCs w:val="22"/>
+        </w:rPr>
+        <w:t xml:space="preserve">A. Krivda, “Automated recognition of partial discharges,” </w:t>
+      </w:r>
+      <w:r>
+        <w:rPr>
+          <w:rFonts w:ascii="Calibri" w:cs="Calibri" w:eastAsia="Calibri" w:hAnsi="Calibri"/>
+          <w:i/>
+          <w:iCs/>
+          <w:sz w:val="22"/>
+          <w:szCs w:val="22"/>
+        </w:rPr>
+        <w:t xml:space="preserve">IEEE Trans. Dielectr. Electr. Insul.</w:t>
+      </w:r>
+      <w:r>
+        <w:rPr>
+          <w:rFonts w:ascii="Calibri" w:cs="Calibri" w:eastAsia="Calibri" w:hAnsi="Calibri"/>
+          <w:sz w:val="22"/>
+          <w:szCs w:val="22"/>
+        </w:rPr>
+        <w:t xml:space="preserve">, vol. 2, no. 5, pp. 796–821, 1995.</w:t>
+      </w:r>
+      <w:r>
+        <w:rPr>
+          <w:rFonts w:ascii="Calibri" w:cs="Calibri" w:eastAsia="Calibri" w:hAnsi="Calibri"/>
+          <w:sz w:val="22"/>
+          <w:szCs w:val="22"/>
+        </w:rPr>
+        <w:t xml:space="preserve"> </w:t>
+      </w:r>
+      <w:hyperlink w:history="1" r:id="rIddsl9knmwetcmh7jvxehxz">
+        <w:r>
+          <w:rPr>
+            <w:rStyle w:val="Hyperlink"/>
+            <w:rFonts w:ascii="Calibri" w:cs="Calibri" w:eastAsia="Calibri" w:hAnsi="Calibri"/>
+            <w:sz w:val="22"/>
+            <w:szCs w:val="22"/>
+          </w:rPr>
+          <w:t xml:space="preserve">https://doi.org/10.1109/94.469976</w:t>
+        </w:r>
+      </w:hyperlink>
+    </w:p>
+    <w:p>
+      <w:pPr>
+        <w:spacing w:after="100"/>
+        <w:ind w:left="500" w:hanging="500"/>
+      </w:pPr>
+      <w:r>
+        <w:rPr>
+          <w:rFonts w:ascii="Calibri" w:cs="Calibri" w:eastAsia="Calibri" w:hAnsi="Calibri"/>
+          <w:sz w:val="22"/>
+          <w:szCs w:val="22"/>
+        </w:rPr>
+        <w:t xml:space="preserve">[3]	</w:t>
+      </w:r>
+      <w:r>
+        <w:rPr>
+          <w:rFonts w:ascii="Calibri" w:cs="Calibri" w:eastAsia="Calibri" w:hAnsi="Calibri"/>
+          <w:sz w:val="22"/>
+          <w:szCs w:val="22"/>
+        </w:rPr>
+        <w:t xml:space="preserve">E. Gulski and A. Krivda, “Neural networks as a tool for recognition of partial discharges,” </w:t>
+      </w:r>
+      <w:r>
+        <w:rPr>
+          <w:rFonts w:ascii="Calibri" w:cs="Calibri" w:eastAsia="Calibri" w:hAnsi="Calibri"/>
+          <w:i/>
+          <w:iCs/>
+          <w:sz w:val="22"/>
+          <w:szCs w:val="22"/>
+        </w:rPr>
+        <w:t xml:space="preserve">IEEE Trans. Electr. Insul.</w:t>
+      </w:r>
+      <w:r>
+        <w:rPr>
+          <w:rFonts w:ascii="Calibri" w:cs="Calibri" w:eastAsia="Calibri" w:hAnsi="Calibri"/>
+          <w:sz w:val="22"/>
+          <w:szCs w:val="22"/>
+        </w:rPr>
+        <w:t xml:space="preserve">, vol. 28, no. 6, pp. 984–1001, 1993.</w:t>
+      </w:r>
+      <w:r>
+        <w:rPr>
+          <w:rFonts w:ascii="Calibri" w:cs="Calibri" w:eastAsia="Calibri" w:hAnsi="Calibri"/>
+          <w:sz w:val="22"/>
+          <w:szCs w:val="22"/>
+        </w:rPr>
+        <w:t xml:space="preserve"> </w:t>
+      </w:r>
+      <w:hyperlink w:history="1" r:id="rId0lvyax1vemijsaryfotqx">
+        <w:r>
+          <w:rPr>
+            <w:rStyle w:val="Hyperlink"/>
+            <w:rFonts w:ascii="Calibri" w:cs="Calibri" w:eastAsia="Calibri" w:hAnsi="Calibri"/>
+            <w:sz w:val="22"/>
+            <w:szCs w:val="22"/>
+          </w:rPr>
+          <w:t xml:space="preserve">https://doi.org/10.1109/14.249372</w:t>
+        </w:r>
+      </w:hyperlink>
+    </w:p>
+    <w:p>
+      <w:pPr>
+        <w:spacing w:after="100"/>
+        <w:ind w:left="500" w:hanging="500"/>
+      </w:pPr>
+      <w:r>
+        <w:rPr>
+          <w:rFonts w:ascii="Calibri" w:cs="Calibri" w:eastAsia="Calibri" w:hAnsi="Calibri"/>
+          <w:sz w:val="22"/>
+          <w:szCs w:val="22"/>
+        </w:rPr>
+        <w:t xml:space="preserve">[4]	</w:t>
+      </w:r>
+      <w:r>
+        <w:rPr>
+          <w:rFonts w:ascii="Calibri" w:cs="Calibri" w:eastAsia="Calibri" w:hAnsi="Calibri"/>
+          <w:sz w:val="22"/>
+          <w:szCs w:val="22"/>
+        </w:rPr>
+        <w:t xml:space="preserve">H. Kumar, M. Shafiq, K. Kauhaniemi, and M. Elmusrati, “A review on the classification of partial discharges in medium-voltage cables: detection, feature extraction, artificial intelligence-based classification, and optimization techniques,” </w:t>
+      </w:r>
+      <w:r>
+        <w:rPr>
+          <w:rFonts w:ascii="Calibri" w:cs="Calibri" w:eastAsia="Calibri" w:hAnsi="Calibri"/>
+          <w:i/>
+          <w:iCs/>
+          <w:sz w:val="22"/>
+          <w:szCs w:val="22"/>
+        </w:rPr>
+        <w:t xml:space="preserve">Energies</w:t>
+      </w:r>
+      <w:r>
+        <w:rPr>
+          <w:rFonts w:ascii="Calibri" w:cs="Calibri" w:eastAsia="Calibri" w:hAnsi="Calibri"/>
+          <w:sz w:val="22"/>
+          <w:szCs w:val="22"/>
+        </w:rPr>
+        <w:t xml:space="preserve">, vol. 17, no. 5, 1142, 2024.</w:t>
+      </w:r>
+      <w:r>
+        <w:rPr>
+          <w:rFonts w:ascii="Calibri" w:cs="Calibri" w:eastAsia="Calibri" w:hAnsi="Calibri"/>
+          <w:sz w:val="22"/>
+          <w:szCs w:val="22"/>
+        </w:rPr>
+        <w:t xml:space="preserve"> </w:t>
+      </w:r>
+      <w:hyperlink w:history="1" r:id="rId5zavtpulg_0gy_wx7p8a0">
+        <w:r>
+          <w:rPr>
+            <w:rStyle w:val="Hyperlink"/>
+            <w:rFonts w:ascii="Calibri" w:cs="Calibri" w:eastAsia="Calibri" w:hAnsi="Calibri"/>
+            <w:sz w:val="22"/>
+            <w:szCs w:val="22"/>
+          </w:rPr>
+          <w:t xml:space="preserve">https://doi.org/10.3390/en17051142</w:t>
+        </w:r>
+      </w:hyperlink>
+    </w:p>
+    <w:p>
+      <w:pPr>
+        <w:spacing w:after="100"/>
+        <w:ind w:left="500" w:hanging="500"/>
+      </w:pPr>
+      <w:r>
+        <w:rPr>
+          <w:rFonts w:ascii="Calibri" w:cs="Calibri" w:eastAsia="Calibri" w:hAnsi="Calibri"/>
+          <w:sz w:val="22"/>
+          <w:szCs w:val="22"/>
+        </w:rPr>
+        <w:t xml:space="preserve">[6]	</w:t>
+      </w:r>
+      <w:r>
+        <w:rPr>
+          <w:rFonts w:ascii="Calibri" w:cs="Calibri" w:eastAsia="Calibri" w:hAnsi="Calibri"/>
+          <w:sz w:val="22"/>
+          <w:szCs w:val="22"/>
+        </w:rPr>
+        <w:t xml:space="preserve">C. Sun </w:t>
+      </w:r>
+      <w:r>
+        <w:rPr>
+          <w:rFonts w:ascii="Calibri" w:cs="Calibri" w:eastAsia="Calibri" w:hAnsi="Calibri"/>
+          <w:i/>
+          <w:iCs/>
+          <w:sz w:val="22"/>
+          <w:szCs w:val="22"/>
+        </w:rPr>
+        <w:t xml:space="preserve">et al.</w:t>
+      </w:r>
+      <w:r>
+        <w:rPr>
+          <w:rFonts w:ascii="Calibri" w:cs="Calibri" w:eastAsia="Calibri" w:hAnsi="Calibri"/>
+          <w:sz w:val="22"/>
+          <w:szCs w:val="22"/>
+        </w:rPr>
+        <w:t xml:space="preserve">, “Convolutional neural network-based pattern recognition of partial discharge in high-speed electric-multiple-unit cable termination,” </w:t>
+      </w:r>
+      <w:r>
+        <w:rPr>
+          <w:rFonts w:ascii="Calibri" w:cs="Calibri" w:eastAsia="Calibri" w:hAnsi="Calibri"/>
+          <w:i/>
+          <w:iCs/>
+          <w:sz w:val="22"/>
+          <w:szCs w:val="22"/>
+        </w:rPr>
+        <w:t xml:space="preserve">Sensors</w:t>
+      </w:r>
+      <w:r>
+        <w:rPr>
+          <w:rFonts w:ascii="Calibri" w:cs="Calibri" w:eastAsia="Calibri" w:hAnsi="Calibri"/>
+          <w:sz w:val="22"/>
+          <w:szCs w:val="22"/>
+        </w:rPr>
+        <w:t xml:space="preserve">, vol. 24, no. 8, 2660, 2024.</w:t>
+      </w:r>
+      <w:r>
+        <w:rPr>
+          <w:rFonts w:ascii="Calibri" w:cs="Calibri" w:eastAsia="Calibri" w:hAnsi="Calibri"/>
+          <w:sz w:val="22"/>
+          <w:szCs w:val="22"/>
+        </w:rPr>
+        <w:t xml:space="preserve"> </w:t>
+      </w:r>
+      <w:hyperlink w:history="1" r:id="rIdkjd2vjpukkjvoula-ntjb">
+        <w:r>
+          <w:rPr>
+            <w:rStyle w:val="Hyperlink"/>
+            <w:rFonts w:ascii="Calibri" w:cs="Calibri" w:eastAsia="Calibri" w:hAnsi="Calibri"/>
+            <w:sz w:val="22"/>
+            <w:szCs w:val="22"/>
+          </w:rPr>
+          <w:t xml:space="preserve">https://doi.org/10.3390/s24082660</w:t>
+        </w:r>
+      </w:hyperlink>
+    </w:p>
+    <w:p>
+      <w:pPr>
+        <w:spacing w:after="100"/>
+        <w:ind w:left="500" w:hanging="500"/>
+      </w:pPr>
+      <w:r>
+        <w:rPr>
+          <w:rFonts w:ascii="Calibri" w:cs="Calibri" w:eastAsia="Calibri" w:hAnsi="Calibri"/>
+          <w:sz w:val="22"/>
+          <w:szCs w:val="22"/>
+        </w:rPr>
+        <w:t xml:space="preserve">[7]	</w:t>
+      </w:r>
+      <w:r>
+        <w:rPr>
+          <w:rFonts w:ascii="Calibri" w:cs="Calibri" w:eastAsia="Calibri" w:hAnsi="Calibri"/>
+          <w:sz w:val="22"/>
+          <w:szCs w:val="22"/>
+        </w:rPr>
+        <w:t xml:space="preserve">C. Qin </w:t>
+      </w:r>
+      <w:r>
+        <w:rPr>
+          <w:rFonts w:ascii="Calibri" w:cs="Calibri" w:eastAsia="Calibri" w:hAnsi="Calibri"/>
+          <w:i/>
+          <w:iCs/>
+          <w:sz w:val="22"/>
+          <w:szCs w:val="22"/>
+        </w:rPr>
+        <w:t xml:space="preserve">et al.</w:t>
+      </w:r>
+      <w:r>
+        <w:rPr>
+          <w:rFonts w:ascii="Calibri" w:cs="Calibri" w:eastAsia="Calibri" w:hAnsi="Calibri"/>
+          <w:sz w:val="22"/>
+          <w:szCs w:val="22"/>
+        </w:rPr>
+        <w:t xml:space="preserve">, “Partial discharge signal pattern recognition of composite insulation defects in cross-linked polyethylene cables,” </w:t>
+      </w:r>
+      <w:r>
+        <w:rPr>
+          <w:rFonts w:ascii="Calibri" w:cs="Calibri" w:eastAsia="Calibri" w:hAnsi="Calibri"/>
+          <w:i/>
+          <w:iCs/>
+          <w:sz w:val="22"/>
+          <w:szCs w:val="22"/>
+        </w:rPr>
+        <w:t xml:space="preserve">Sensors</w:t>
+      </w:r>
+      <w:r>
+        <w:rPr>
+          <w:rFonts w:ascii="Calibri" w:cs="Calibri" w:eastAsia="Calibri" w:hAnsi="Calibri"/>
+          <w:sz w:val="22"/>
+          <w:szCs w:val="22"/>
+        </w:rPr>
+        <w:t xml:space="preserve">, vol. 24, no. 11, 3460, 2024.</w:t>
+      </w:r>
+      <w:r>
+        <w:rPr>
+          <w:rFonts w:ascii="Calibri" w:cs="Calibri" w:eastAsia="Calibri" w:hAnsi="Calibri"/>
+          <w:sz w:val="22"/>
+          <w:szCs w:val="22"/>
+        </w:rPr>
+        <w:t xml:space="preserve"> </w:t>
+      </w:r>
+      <w:hyperlink w:history="1" r:id="rIddlxgqg5d6nwdtcsrvey85">
+        <w:r>
+          <w:rPr>
+            <w:rStyle w:val="Hyperlink"/>
+            <w:rFonts w:ascii="Calibri" w:cs="Calibri" w:eastAsia="Calibri" w:hAnsi="Calibri"/>
+            <w:sz w:val="22"/>
+            <w:szCs w:val="22"/>
+          </w:rPr>
+          <w:t xml:space="preserve">https://doi.org/10.3390/s24113460</w:t>
+        </w:r>
+      </w:hyperlink>
+    </w:p>
+    <w:p>
+      <w:pPr>
+        <w:spacing w:after="100"/>
+        <w:ind w:left="500" w:hanging="500"/>
+      </w:pPr>
+      <w:r>
+        <w:rPr>
+          <w:rFonts w:ascii="Calibri" w:cs="Calibri" w:eastAsia="Calibri" w:hAnsi="Calibri"/>
+          <w:sz w:val="22"/>
+          <w:szCs w:val="22"/>
+        </w:rPr>
+        <w:t xml:space="preserve">[8]	</w:t>
+      </w:r>
+      <w:r>
+        <w:rPr>
+          <w:rFonts w:ascii="Calibri" w:cs="Calibri" w:eastAsia="Calibri" w:hAnsi="Calibri"/>
+          <w:sz w:val="22"/>
+          <w:szCs w:val="22"/>
+        </w:rPr>
+        <w:t xml:space="preserve">W. J. K. Raymond, H. A. Illias, and A. H. A. Bakar, “Classification of partial discharge measured under different levels of noise contamination,” </w:t>
+      </w:r>
+      <w:r>
+        <w:rPr>
+          <w:rFonts w:ascii="Calibri" w:cs="Calibri" w:eastAsia="Calibri" w:hAnsi="Calibri"/>
+          <w:i/>
+          <w:iCs/>
+          <w:sz w:val="22"/>
+          <w:szCs w:val="22"/>
+        </w:rPr>
         <w:t xml:space="preserve">PLOS ONE</w:t>
       </w:r>
       <w:r>
@@ -2667,7 +2493,7 @@
         </w:rPr>
         <w:t xml:space="preserve"> </w:t>
       </w:r>
-      <w:hyperlink w:history="1" r:id="rIdsw5awnfddivzzvkuhl7be">
+      <w:hyperlink w:history="1" r:id="rIdlumposcyximbsh1wn6sq2">
         <w:r>
           <w:rPr>
             <w:rStyle w:val="Hyperlink"/>
@@ -2690,15 +2516,15 @@
           <w:sz w:val="22"/>
           <w:szCs w:val="22"/>
         </w:rPr>
-        <w:t xml:space="preserve">[2]	</w:t>
-      </w:r>
-      <w:r>
-        <w:rPr>
-          <w:rFonts w:ascii="Calibri" w:cs="Calibri" w:eastAsia="Calibri" w:hAnsi="Calibri"/>
-          <w:sz w:val="22"/>
-          <w:szCs w:val="22"/>
-        </w:rPr>
-        <w:t xml:space="preserve">N. C. Sahoo, M. M. A. Salama, and R. Bartnikas, “Trends in partial discharge pattern classification: a survey,” </w:t>
+        <w:t xml:space="preserve">[9]	</w:t>
+      </w:r>
+      <w:r>
+        <w:rPr>
+          <w:rFonts w:ascii="Calibri" w:cs="Calibri" w:eastAsia="Calibri" w:hAnsi="Calibri"/>
+          <w:sz w:val="22"/>
+          <w:szCs w:val="22"/>
+        </w:rPr>
+        <w:t xml:space="preserve">X. Peng </w:t>
       </w:r>
       <w:r>
         <w:rPr>
@@ -2708,56 +2534,15 @@
           <w:sz w:val="22"/>
           <w:szCs w:val="22"/>
         </w:rPr>
-        <w:t xml:space="preserve">IEEE Trans. Dielectr. Electr. Insul.</w:t>
-      </w:r>
-      <w:r>
-        <w:rPr>
-          <w:rFonts w:ascii="Calibri" w:cs="Calibri" w:eastAsia="Calibri" w:hAnsi="Calibri"/>
-          <w:sz w:val="22"/>
-          <w:szCs w:val="22"/>
-        </w:rPr>
-        <w:t xml:space="preserve">, vol. 12, no. 2, pp. 248–264, 2005.</w:t>
-      </w:r>
-      <w:r>
-        <w:rPr>
-          <w:rFonts w:ascii="Calibri" w:cs="Calibri" w:eastAsia="Calibri" w:hAnsi="Calibri"/>
-          <w:sz w:val="22"/>
-          <w:szCs w:val="22"/>
-        </w:rPr>
-        <w:t xml:space="preserve"> </w:t>
-      </w:r>
-      <w:hyperlink w:history="1" r:id="rIdx2jwiml-j9xtywyrm0pu7">
-        <w:r>
-          <w:rPr>
-            <w:rStyle w:val="Hyperlink"/>
-            <w:rFonts w:ascii="Calibri" w:cs="Calibri" w:eastAsia="Calibri" w:hAnsi="Calibri"/>
-            <w:sz w:val="22"/>
-            <w:szCs w:val="22"/>
-          </w:rPr>
-          <w:t xml:space="preserve">https://doi.org/10.1109/TDEI.2005.1430395</w:t>
-        </w:r>
-      </w:hyperlink>
-    </w:p>
-    <w:p>
-      <w:pPr>
-        <w:spacing w:after="100"/>
-        <w:ind w:left="500" w:hanging="500"/>
-      </w:pPr>
-      <w:r>
-        <w:rPr>
-          <w:rFonts w:ascii="Calibri" w:cs="Calibri" w:eastAsia="Calibri" w:hAnsi="Calibri"/>
-          <w:sz w:val="22"/>
-          <w:szCs w:val="22"/>
-        </w:rPr>
-        <w:t xml:space="preserve">[3]	</w:t>
-      </w:r>
-      <w:r>
-        <w:rPr>
-          <w:rFonts w:ascii="Calibri" w:cs="Calibri" w:eastAsia="Calibri" w:hAnsi="Calibri"/>
-          <w:sz w:val="22"/>
-          <w:szCs w:val="22"/>
-        </w:rPr>
-        <w:t xml:space="preserve">A. Krivda, “Automated recognition of partial discharges,” </w:t>
+        <w:t xml:space="preserve">et al.</w:t>
+      </w:r>
+      <w:r>
+        <w:rPr>
+          <w:rFonts w:ascii="Calibri" w:cs="Calibri" w:eastAsia="Calibri" w:hAnsi="Calibri"/>
+          <w:sz w:val="22"/>
+          <w:szCs w:val="22"/>
+        </w:rPr>
+        <w:t xml:space="preserve">, “Random forest based optimal feature selection for partial discharge pattern recognition in HV cables,” </w:t>
       </w:r>
       <w:r>
         <w:rPr>
@@ -2767,15 +2552,15 @@
           <w:sz w:val="22"/>
           <w:szCs w:val="22"/>
         </w:rPr>
-        <w:t xml:space="preserve">IEEE Trans. Dielectr. Electr. Insul.</w:t>
-      </w:r>
-      <w:r>
-        <w:rPr>
-          <w:rFonts w:ascii="Calibri" w:cs="Calibri" w:eastAsia="Calibri" w:hAnsi="Calibri"/>
-          <w:sz w:val="22"/>
-          <w:szCs w:val="22"/>
-        </w:rPr>
-        <w:t xml:space="preserve">, vol. 2, no. 5, pp. 796–821, 1995.</w:t>
+        <w:t xml:space="preserve">IEEE Trans. Power Del.</w:t>
+      </w:r>
+      <w:r>
+        <w:rPr>
+          <w:rFonts w:ascii="Calibri" w:cs="Calibri" w:eastAsia="Calibri" w:hAnsi="Calibri"/>
+          <w:sz w:val="22"/>
+          <w:szCs w:val="22"/>
+        </w:rPr>
+        <w:t xml:space="preserve">, vol. 34, no. 4, pp. 1715–1724, 2019.</w:t>
       </w:r>
       <w:r>
         <w:rPr>
@@ -2785,356 +2570,7 @@
         </w:rPr>
         <w:t xml:space="preserve"> </w:t>
       </w:r>
-      <w:hyperlink w:history="1" r:id="rIdw9c-5xxde5ntv6nxw52yq">
-        <w:r>
-          <w:rPr>
-            <w:rStyle w:val="Hyperlink"/>
-            <w:rFonts w:ascii="Calibri" w:cs="Calibri" w:eastAsia="Calibri" w:hAnsi="Calibri"/>
-            <w:sz w:val="22"/>
-            <w:szCs w:val="22"/>
-          </w:rPr>
-          <w:t xml:space="preserve">https://doi.org/10.1109/94.469976</w:t>
-        </w:r>
-      </w:hyperlink>
-    </w:p>
-    <w:p>
-      <w:pPr>
-        <w:spacing w:after="100"/>
-        <w:ind w:left="500" w:hanging="500"/>
-      </w:pPr>
-      <w:r>
-        <w:rPr>
-          <w:rFonts w:ascii="Calibri" w:cs="Calibri" w:eastAsia="Calibri" w:hAnsi="Calibri"/>
-          <w:sz w:val="22"/>
-          <w:szCs w:val="22"/>
-        </w:rPr>
-        <w:t xml:space="preserve">[4]	</w:t>
-      </w:r>
-      <w:r>
-        <w:rPr>
-          <w:rFonts w:ascii="Calibri" w:cs="Calibri" w:eastAsia="Calibri" w:hAnsi="Calibri"/>
-          <w:sz w:val="22"/>
-          <w:szCs w:val="22"/>
-        </w:rPr>
-        <w:t xml:space="preserve">H. Kumar, M. Shafiq, K. Kauhaniemi, and M. Elmusrati, “A review on the classification of partial discharges in medium-voltage cables: detection, feature extraction, artificial intelligence-based classification, and optimization techniques,” </w:t>
-      </w:r>
-      <w:r>
-        <w:rPr>
-          <w:rFonts w:ascii="Calibri" w:cs="Calibri" w:eastAsia="Calibri" w:hAnsi="Calibri"/>
-          <w:i/>
-          <w:iCs/>
-          <w:sz w:val="22"/>
-          <w:szCs w:val="22"/>
-        </w:rPr>
-        <w:t xml:space="preserve">Energies</w:t>
-      </w:r>
-      <w:r>
-        <w:rPr>
-          <w:rFonts w:ascii="Calibri" w:cs="Calibri" w:eastAsia="Calibri" w:hAnsi="Calibri"/>
-          <w:sz w:val="22"/>
-          <w:szCs w:val="22"/>
-        </w:rPr>
-        <w:t xml:space="preserve">, vol. 17, no. 5, 1142, 2024.</w:t>
-      </w:r>
-      <w:r>
-        <w:rPr>
-          <w:rFonts w:ascii="Calibri" w:cs="Calibri" w:eastAsia="Calibri" w:hAnsi="Calibri"/>
-          <w:sz w:val="22"/>
-          <w:szCs w:val="22"/>
-        </w:rPr>
-        <w:t xml:space="preserve"> </w:t>
-      </w:r>
-      <w:hyperlink w:history="1" r:id="rIdy_t83tbglwwdhrzhlvvp2">
-        <w:r>
-          <w:rPr>
-            <w:rStyle w:val="Hyperlink"/>
-            <w:rFonts w:ascii="Calibri" w:cs="Calibri" w:eastAsia="Calibri" w:hAnsi="Calibri"/>
-            <w:sz w:val="22"/>
-            <w:szCs w:val="22"/>
-          </w:rPr>
-          <w:t xml:space="preserve">https://doi.org/10.3390/en17051142</w:t>
-        </w:r>
-      </w:hyperlink>
-    </w:p>
-    <w:p>
-      <w:pPr>
-        <w:spacing w:after="100"/>
-        <w:ind w:left="500" w:hanging="500"/>
-      </w:pPr>
-      <w:r>
-        <w:rPr>
-          <w:rFonts w:ascii="Calibri" w:cs="Calibri" w:eastAsia="Calibri" w:hAnsi="Calibri"/>
-          <w:sz w:val="22"/>
-          <w:szCs w:val="22"/>
-        </w:rPr>
-        <w:t xml:space="preserve">[5]	</w:t>
-      </w:r>
-      <w:r>
-        <w:rPr>
-          <w:rFonts w:ascii="Calibri" w:cs="Calibri" w:eastAsia="Calibri" w:hAnsi="Calibri"/>
-          <w:sz w:val="22"/>
-          <w:szCs w:val="22"/>
-        </w:rPr>
-        <w:t xml:space="preserve">E. Gulski and A. Krivda, “Neural networks as a tool for recognition of partial discharges,” </w:t>
-      </w:r>
-      <w:r>
-        <w:rPr>
-          <w:rFonts w:ascii="Calibri" w:cs="Calibri" w:eastAsia="Calibri" w:hAnsi="Calibri"/>
-          <w:i/>
-          <w:iCs/>
-          <w:sz w:val="22"/>
-          <w:szCs w:val="22"/>
-        </w:rPr>
-        <w:t xml:space="preserve">IEEE Trans. Electr. Insul.</w:t>
-      </w:r>
-      <w:r>
-        <w:rPr>
-          <w:rFonts w:ascii="Calibri" w:cs="Calibri" w:eastAsia="Calibri" w:hAnsi="Calibri"/>
-          <w:sz w:val="22"/>
-          <w:szCs w:val="22"/>
-        </w:rPr>
-        <w:t xml:space="preserve">, vol. 28, no. 6, pp. 984–1001, 1993.</w:t>
-      </w:r>
-      <w:r>
-        <w:rPr>
-          <w:rFonts w:ascii="Calibri" w:cs="Calibri" w:eastAsia="Calibri" w:hAnsi="Calibri"/>
-          <w:sz w:val="22"/>
-          <w:szCs w:val="22"/>
-        </w:rPr>
-        <w:t xml:space="preserve"> </w:t>
-      </w:r>
-      <w:hyperlink w:history="1" r:id="rIdxmz5pbwawebfkiq4h9wsx">
-        <w:r>
-          <w:rPr>
-            <w:rStyle w:val="Hyperlink"/>
-            <w:rFonts w:ascii="Calibri" w:cs="Calibri" w:eastAsia="Calibri" w:hAnsi="Calibri"/>
-            <w:sz w:val="22"/>
-            <w:szCs w:val="22"/>
-          </w:rPr>
-          <w:t xml:space="preserve">https://doi.org/10.1109/14.249372</w:t>
-        </w:r>
-      </w:hyperlink>
-    </w:p>
-    <w:p>
-      <w:pPr>
-        <w:spacing w:after="100"/>
-        <w:ind w:left="500" w:hanging="500"/>
-      </w:pPr>
-      <w:r>
-        <w:rPr>
-          <w:rFonts w:ascii="Calibri" w:cs="Calibri" w:eastAsia="Calibri" w:hAnsi="Calibri"/>
-          <w:sz w:val="22"/>
-          <w:szCs w:val="22"/>
-        </w:rPr>
-        <w:t xml:space="preserve">[7]	</w:t>
-      </w:r>
-      <w:r>
-        <w:rPr>
-          <w:rFonts w:ascii="Calibri" w:cs="Calibri" w:eastAsia="Calibri" w:hAnsi="Calibri"/>
-          <w:sz w:val="22"/>
-          <w:szCs w:val="22"/>
-        </w:rPr>
-        <w:t xml:space="preserve">C. Sun </w:t>
-      </w:r>
-      <w:r>
-        <w:rPr>
-          <w:rFonts w:ascii="Calibri" w:cs="Calibri" w:eastAsia="Calibri" w:hAnsi="Calibri"/>
-          <w:i/>
-          <w:iCs/>
-          <w:sz w:val="22"/>
-          <w:szCs w:val="22"/>
-        </w:rPr>
-        <w:t xml:space="preserve">et al.</w:t>
-      </w:r>
-      <w:r>
-        <w:rPr>
-          <w:rFonts w:ascii="Calibri" w:cs="Calibri" w:eastAsia="Calibri" w:hAnsi="Calibri"/>
-          <w:sz w:val="22"/>
-          <w:szCs w:val="22"/>
-        </w:rPr>
-        <w:t xml:space="preserve">, “Convolutional neural network-based pattern recognition of partial discharge in high-speed electric-multiple-unit cable termination,” </w:t>
-      </w:r>
-      <w:r>
-        <w:rPr>
-          <w:rFonts w:ascii="Calibri" w:cs="Calibri" w:eastAsia="Calibri" w:hAnsi="Calibri"/>
-          <w:i/>
-          <w:iCs/>
-          <w:sz w:val="22"/>
-          <w:szCs w:val="22"/>
-        </w:rPr>
-        <w:t xml:space="preserve">Sensors</w:t>
-      </w:r>
-      <w:r>
-        <w:rPr>
-          <w:rFonts w:ascii="Calibri" w:cs="Calibri" w:eastAsia="Calibri" w:hAnsi="Calibri"/>
-          <w:sz w:val="22"/>
-          <w:szCs w:val="22"/>
-        </w:rPr>
-        <w:t xml:space="preserve">, vol. 24, no. 8, 2660, 2024.</w:t>
-      </w:r>
-      <w:r>
-        <w:rPr>
-          <w:rFonts w:ascii="Calibri" w:cs="Calibri" w:eastAsia="Calibri" w:hAnsi="Calibri"/>
-          <w:sz w:val="22"/>
-          <w:szCs w:val="22"/>
-        </w:rPr>
-        <w:t xml:space="preserve"> </w:t>
-      </w:r>
-      <w:hyperlink w:history="1" r:id="rIdujtegoe714yunhkwtfwb4">
-        <w:r>
-          <w:rPr>
-            <w:rStyle w:val="Hyperlink"/>
-            <w:rFonts w:ascii="Calibri" w:cs="Calibri" w:eastAsia="Calibri" w:hAnsi="Calibri"/>
-            <w:sz w:val="22"/>
-            <w:szCs w:val="22"/>
-          </w:rPr>
-          <w:t xml:space="preserve">https://doi.org/10.3390/s24082660</w:t>
-        </w:r>
-      </w:hyperlink>
-    </w:p>
-    <w:p>
-      <w:pPr>
-        <w:spacing w:after="100"/>
-        <w:ind w:left="500" w:hanging="500"/>
-      </w:pPr>
-      <w:r>
-        <w:rPr>
-          <w:rFonts w:ascii="Calibri" w:cs="Calibri" w:eastAsia="Calibri" w:hAnsi="Calibri"/>
-          <w:sz w:val="22"/>
-          <w:szCs w:val="22"/>
-        </w:rPr>
-        <w:t xml:space="preserve">[8]	</w:t>
-      </w:r>
-      <w:r>
-        <w:rPr>
-          <w:rFonts w:ascii="Calibri" w:cs="Calibri" w:eastAsia="Calibri" w:hAnsi="Calibri"/>
-          <w:sz w:val="22"/>
-          <w:szCs w:val="22"/>
-        </w:rPr>
-        <w:t xml:space="preserve">C. Qin </w:t>
-      </w:r>
-      <w:r>
-        <w:rPr>
-          <w:rFonts w:ascii="Calibri" w:cs="Calibri" w:eastAsia="Calibri" w:hAnsi="Calibri"/>
-          <w:i/>
-          <w:iCs/>
-          <w:sz w:val="22"/>
-          <w:szCs w:val="22"/>
-        </w:rPr>
-        <w:t xml:space="preserve">et al.</w:t>
-      </w:r>
-      <w:r>
-        <w:rPr>
-          <w:rFonts w:ascii="Calibri" w:cs="Calibri" w:eastAsia="Calibri" w:hAnsi="Calibri"/>
-          <w:sz w:val="22"/>
-          <w:szCs w:val="22"/>
-        </w:rPr>
-        <w:t xml:space="preserve">, “Partial discharge signal pattern recognition of composite insulation defects in cross-linked polyethylene cables,” </w:t>
-      </w:r>
-      <w:r>
-        <w:rPr>
-          <w:rFonts w:ascii="Calibri" w:cs="Calibri" w:eastAsia="Calibri" w:hAnsi="Calibri"/>
-          <w:i/>
-          <w:iCs/>
-          <w:sz w:val="22"/>
-          <w:szCs w:val="22"/>
-        </w:rPr>
-        <w:t xml:space="preserve">Sensors</w:t>
-      </w:r>
-      <w:r>
-        <w:rPr>
-          <w:rFonts w:ascii="Calibri" w:cs="Calibri" w:eastAsia="Calibri" w:hAnsi="Calibri"/>
-          <w:sz w:val="22"/>
-          <w:szCs w:val="22"/>
-        </w:rPr>
-        <w:t xml:space="preserve">, vol. 24, no. 11, 3460, 2024.</w:t>
-      </w:r>
-      <w:r>
-        <w:rPr>
-          <w:rFonts w:ascii="Calibri" w:cs="Calibri" w:eastAsia="Calibri" w:hAnsi="Calibri"/>
-          <w:sz w:val="22"/>
-          <w:szCs w:val="22"/>
-        </w:rPr>
-        <w:t xml:space="preserve"> </w:t>
-      </w:r>
-      <w:hyperlink w:history="1" r:id="rIdezhlnjlxlkyaegb3f30sx">
-        <w:r>
-          <w:rPr>
-            <w:rStyle w:val="Hyperlink"/>
-            <w:rFonts w:ascii="Calibri" w:cs="Calibri" w:eastAsia="Calibri" w:hAnsi="Calibri"/>
-            <w:sz w:val="22"/>
-            <w:szCs w:val="22"/>
-          </w:rPr>
-          <w:t xml:space="preserve">https://doi.org/10.3390/s24113460</w:t>
-        </w:r>
-      </w:hyperlink>
-    </w:p>
-    <w:p>
-      <w:pPr>
-        <w:spacing w:after="100"/>
-        <w:ind w:left="500" w:hanging="500"/>
-      </w:pPr>
-      <w:r>
-        <w:rPr>
-          <w:rFonts w:ascii="Calibri" w:cs="Calibri" w:eastAsia="Calibri" w:hAnsi="Calibri"/>
-          <w:sz w:val="22"/>
-          <w:szCs w:val="22"/>
-        </w:rPr>
-        <w:t xml:space="preserve">[9]	</w:t>
-      </w:r>
-      <w:r>
-        <w:rPr>
-          <w:rFonts w:ascii="Calibri" w:cs="Calibri" w:eastAsia="Calibri" w:hAnsi="Calibri"/>
-          <w:sz w:val="22"/>
-          <w:szCs w:val="22"/>
-        </w:rPr>
-        <w:t xml:space="preserve">X. Peng </w:t>
-      </w:r>
-      <w:r>
-        <w:rPr>
-          <w:rFonts w:ascii="Calibri" w:cs="Calibri" w:eastAsia="Calibri" w:hAnsi="Calibri"/>
-          <w:i/>
-          <w:iCs/>
-          <w:sz w:val="22"/>
-          <w:szCs w:val="22"/>
-        </w:rPr>
-        <w:t xml:space="preserve">et al.</w:t>
-      </w:r>
-      <w:r>
-        <w:rPr>
-          <w:rFonts w:ascii="Calibri" w:cs="Calibri" w:eastAsia="Calibri" w:hAnsi="Calibri"/>
-          <w:sz w:val="22"/>
-          <w:szCs w:val="22"/>
-        </w:rPr>
-        <w:t xml:space="preserve">, “Random forest based optimal feature selection for partial discharge pattern recognition in HV cables,” </w:t>
-      </w:r>
-      <w:r>
-        <w:rPr>
-          <w:rFonts w:ascii="Calibri" w:cs="Calibri" w:eastAsia="Calibri" w:hAnsi="Calibri"/>
-          <w:i/>
-          <w:iCs/>
-          <w:sz w:val="22"/>
-          <w:szCs w:val="22"/>
-        </w:rPr>
-        <w:t xml:space="preserve">IEEE Trans. Power Del.</w:t>
-      </w:r>
-      <w:r>
-        <w:rPr>
-          <w:rFonts w:ascii="Calibri" w:cs="Calibri" w:eastAsia="Calibri" w:hAnsi="Calibri"/>
-          <w:sz w:val="22"/>
-          <w:szCs w:val="22"/>
-        </w:rPr>
-        <w:t xml:space="preserve">, vol. 34, no. 4, pp. 1715–1724, 2019.</w:t>
-      </w:r>
-      <w:r>
-        <w:rPr>
-          <w:rFonts w:ascii="Calibri" w:cs="Calibri" w:eastAsia="Calibri" w:hAnsi="Calibri"/>
-          <w:sz w:val="22"/>
-          <w:szCs w:val="22"/>
-        </w:rPr>
-        <w:t xml:space="preserve"> </w:t>
-      </w:r>
-      <w:hyperlink w:history="1" r:id="rIdf0w38dklzjw2w6usw9yo_">
+      <w:hyperlink w:history="1" r:id="rIdcppyvupkrkq8zhhjm_fn8">
         <w:r>
           <w:rPr>
             <w:rStyle w:val="Hyperlink"/>

</xml_diff>